<commit_message>
let users to switch between panels freely, changed buttons images for switching paths' buttons
Will continue working on syncing variables and fix the ending page issue (for now it shows the ending page after finishing path 3 even when players did not finish the path 1 and 2)
</commit_message>
<xml_diff>
--- a/Doc/ICS4U1 CPT Requirements Document.docx
+++ b/Doc/ICS4U1 CPT Requirements Document.docx
@@ -308,7 +308,6 @@
           <w:sz w:val="34"/>
           <w:szCs w:val="34"/>
         </w:rPr>
-        <w:lastRenderedPageBreak/>
         <w:t>Project Overview</w:t>
       </w:r>
     </w:p>
@@ -850,7 +849,7 @@
         <mc:AlternateContent>
           <mc:Choice Requires="wpg">
             <w:drawing>
-              <wp:anchor distT="0" distB="0" distL="114300" distR="114300" simplePos="0" relativeHeight="251674624" behindDoc="0" locked="0" layoutInCell="1" allowOverlap="1" wp14:anchorId="7458A640" wp14:editId="024B15FF">
+              <wp:anchor distT="0" distB="0" distL="114300" distR="114300" simplePos="0" relativeHeight="251658242" behindDoc="0" locked="0" layoutInCell="1" allowOverlap="1" wp14:anchorId="7458A640" wp14:editId="024B15FF">
                 <wp:simplePos x="0" y="0"/>
                 <wp:positionH relativeFrom="column">
                   <wp:posOffset>111125</wp:posOffset>
@@ -1109,7 +1108,7 @@
           </mc:Choice>
           <mc:Fallback>
             <w:pict>
-              <v:group w14:anchorId="7458A640" id="Group 6" o:spid="_x0000_s1026" style="position:absolute;margin-left:8.75pt;margin-top:20.15pt;width:258pt;height:120.5pt;z-index:251674624;mso-width-relative:margin;mso-height-relative:margin" coordsize="32766,15303" o:gfxdata="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">
+              <v:group w14:anchorId="7458A640" id="Group 6" o:spid="_x0000_s1026" style="position:absolute;margin-left:8.75pt;margin-top:20.15pt;width:258pt;height:120.5pt;z-index:251658242;mso-width-relative:margin;mso-height-relative:margin" coordsize="32766,15303" o:gfxdata="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">
                 <v:shapetype id="_x0000_t202" coordsize="21600,21600" o:spt="202" path="m,l,21600r21600,l21600,xe">
                   <v:stroke joinstyle="miter"/>
                   <v:path gradientshapeok="t" o:connecttype="rect"/>
@@ -1277,7 +1276,7 @@
         <mc:AlternateContent>
           <mc:Choice Requires="wps">
             <w:drawing>
-              <wp:anchor distT="0" distB="0" distL="114300" distR="114300" simplePos="0" relativeHeight="251667456" behindDoc="0" locked="0" layoutInCell="1" allowOverlap="1" wp14:anchorId="70FE09C5" wp14:editId="0C726BF7">
+              <wp:anchor distT="0" distB="0" distL="114300" distR="114300" simplePos="0" relativeHeight="251658241" behindDoc="0" locked="0" layoutInCell="1" allowOverlap="1" wp14:anchorId="70FE09C5" wp14:editId="0C726BF7">
                 <wp:simplePos x="0" y="0"/>
                 <wp:positionH relativeFrom="column">
                   <wp:posOffset>107950</wp:posOffset>
@@ -1335,7 +1334,7 @@
               </wp:anchor>
             </w:drawing>
           </mc:Choice>
-          <mc:Fallback>
+          <mc:Fallback xmlns:arto="http://schemas.microsoft.com/office/word/2006/arto">
             <w:pict>
               <v:rect w14:anchorId="6177B70B" id="Rectangle 5" o:spid="_x0000_s1026" style="position:absolute;margin-left:8.5pt;margin-top:20.4pt;width:258pt;height:120.5pt;z-index:251667456;visibility:visible;mso-wrap-style:square;mso-width-percent:0;mso-height-percent:0;mso-wrap-distance-left:9pt;mso-wrap-distance-top:0;mso-wrap-distance-right:9pt;mso-wrap-distance-bottom:0;mso-position-horizontal:absolute;mso-position-horizontal-relative:text;mso-position-vertical:absolute;mso-position-vertical-relative:text;mso-width-percent:0;mso-height-percent:0;mso-width-relative:margin;mso-height-relative:margin;v-text-anchor:middle" o:gfxdata="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" fillcolor="gray [1616]" strokecolor="black [3040]">
                 <v:fill color2="#d9d9d9 [496]" rotate="t" angle="180" colors="0 #bcbcbc;22938f #d0d0d0;1 #ededed" focus="100%" type="gradient"/>
@@ -1432,7 +1431,6 @@
           <w:sz w:val="26"/>
           <w:szCs w:val="26"/>
         </w:rPr>
-        <w:lastRenderedPageBreak/>
         <w:t>Starting Screen Requirement</w:t>
       </w:r>
     </w:p>
@@ -2066,7 +2064,6 @@
         <w:rPr>
           <w:rFonts w:ascii="Calibri" w:eastAsia="Calibri" w:hAnsi="Calibri" w:cs="Calibri"/>
         </w:rPr>
-        <w:lastRenderedPageBreak/>
         <w:t>The network panel should include:</w:t>
       </w:r>
     </w:p>
@@ -3039,7 +3036,6 @@
           <w:sz w:val="26"/>
           <w:szCs w:val="26"/>
         </w:rPr>
-        <w:lastRenderedPageBreak/>
         <w:t>Game Path Requirements</w:t>
       </w:r>
     </w:p>
@@ -3061,6 +3057,24 @@
           <w:rFonts w:ascii="Calibri" w:eastAsia="Calibri" w:hAnsi="Calibri" w:cs="Calibri"/>
         </w:rPr>
         <w:t>games</w:t>
+      </w:r>
+      <w:r>
+        <w:rPr>
+          <w:rFonts w:ascii="Calibri" w:eastAsia="Calibri" w:hAnsi="Calibri" w:cs="Calibri"/>
+        </w:rPr>
+        <w:t>.</w:t>
+      </w:r>
+      <w:r>
+        <w:rPr>
+          <w:rFonts w:ascii="Calibri" w:eastAsia="Calibri" w:hAnsi="Calibri" w:cs="Calibri"/>
+        </w:rPr>
+        <w:t xml:space="preserve"> </w:t>
+      </w:r>
+      <w:r>
+        <w:rPr>
+          <w:rFonts w:ascii="Calibri" w:eastAsia="Calibri" w:hAnsi="Calibri" w:cs="Calibri"/>
+        </w:rPr>
+        <w:t>To provide players with greater flexibility, the game offers three shortcut keys that allow direct access to the paths without going through the entire flow</w:t>
       </w:r>
       <w:r>
         <w:rPr>
@@ -3702,7 +3716,6 @@
               <w:rPr>
                 <w:rFonts w:ascii="Calibri" w:eastAsia="Calibri" w:hAnsi="Calibri" w:cs="Calibri"/>
               </w:rPr>
-              <w:lastRenderedPageBreak/>
               <w:t>Puzzle type or requirement</w:t>
             </w:r>
           </w:p>
@@ -4167,7 +4180,7 @@
       </w:tblGrid>
       <w:tr>
         <w:trPr>
-          <w:trHeight w:val="515"/>
+          <w:trHeight w:val="331"/>
         </w:trPr>
         <w:tc>
           <w:tcPr>
@@ -4591,7 +4604,6 @@
               <w:rPr>
                 <w:rFonts w:ascii="Calibri" w:eastAsia="Calibri" w:hAnsi="Calibri" w:cs="Calibri"/>
               </w:rPr>
-              <w:lastRenderedPageBreak/>
               <w:t>Squirrel</w:t>
             </w:r>
           </w:p>
@@ -4944,15 +4956,7 @@
           <w:b/>
           <w:bCs/>
         </w:rPr>
-        <w:t>Card puzzle</w:t>
-      </w:r>
-      <w:r>
-        <w:rPr>
-          <w:rFonts w:ascii="Calibri" w:eastAsia="Calibri" w:hAnsi="Calibri" w:cs="Calibri"/>
-          <w:b/>
-          <w:bCs/>
-        </w:rPr>
-        <w:t>:</w:t>
+        <w:t>Card puzzle:</w:t>
       </w:r>
     </w:p>
     <w:p>
@@ -4998,7 +5002,7 @@
         <mc:AlternateContent>
           <mc:Choice Requires="wps">
             <w:drawing>
-              <wp:anchor distT="45720" distB="45720" distL="114300" distR="114300" simplePos="0" relativeHeight="251699200" behindDoc="0" locked="0" layoutInCell="1" allowOverlap="1" wp14:anchorId="2A30C409" wp14:editId="5A4598FF">
+              <wp:anchor distT="45720" distB="45720" distL="114300" distR="114300" simplePos="0" relativeHeight="251658254" behindDoc="0" locked="0" layoutInCell="1" allowOverlap="1" wp14:anchorId="2A30C409" wp14:editId="5A4598FF">
                 <wp:simplePos x="0" y="0"/>
                 <wp:positionH relativeFrom="column">
                   <wp:posOffset>3638550</wp:posOffset>
@@ -5082,7 +5086,7 @@
           </mc:Choice>
           <mc:Fallback>
             <w:pict>
-              <v:shape w14:anchorId="2A30C409" id="Text Box 2" o:spid="_x0000_s1030" type="#_x0000_t202" style="position:absolute;margin-left:286.5pt;margin-top:119.6pt;width:41pt;height:110.6pt;z-index:251699200;visibility:visible;mso-wrap-style:square;mso-width-percent:0;mso-height-percent:200;mso-wrap-distance-left:9pt;mso-wrap-distance-top:3.6pt;mso-wrap-distance-right:9pt;mso-wrap-distance-bottom:3.6pt;mso-position-horizontal:absolute;mso-position-horizontal-relative:text;mso-position-vertical:absolute;mso-position-vertical-relative:text;mso-width-percent:0;mso-height-percent:200;mso-width-relative:margin;mso-height-relative:margin;v-text-anchor:top" o:gfxdata="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" filled="f" stroked="f">
+              <v:shape w14:anchorId="2A30C409" id="Text Box 2" o:spid="_x0000_s1030" type="#_x0000_t202" style="position:absolute;margin-left:286.5pt;margin-top:119.6pt;width:41pt;height:110.6pt;z-index:251658254;visibility:visible;mso-wrap-style:square;mso-width-percent:0;mso-height-percent:200;mso-wrap-distance-left:9pt;mso-wrap-distance-top:3.6pt;mso-wrap-distance-right:9pt;mso-wrap-distance-bottom:3.6pt;mso-position-horizontal:absolute;mso-position-horizontal-relative:text;mso-position-vertical:absolute;mso-position-vertical-relative:text;mso-width-percent:0;mso-height-percent:200;mso-width-relative:margin;mso-height-relative:margin;v-text-anchor:top" o:gfxdata="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" filled="f" stroked="f">
                 <v:textbox style="mso-fit-shape-to-text:t">
                   <w:txbxContent>
                     <w:p>
@@ -5126,7 +5130,7 @@
         <mc:AlternateContent>
           <mc:Choice Requires="wps">
             <w:drawing>
-              <wp:anchor distT="45720" distB="45720" distL="114300" distR="114300" simplePos="0" relativeHeight="251697152" behindDoc="0" locked="0" layoutInCell="1" allowOverlap="1" wp14:anchorId="162FFA37" wp14:editId="41A0F23A">
+              <wp:anchor distT="45720" distB="45720" distL="114300" distR="114300" simplePos="0" relativeHeight="251658253" behindDoc="0" locked="0" layoutInCell="1" allowOverlap="1" wp14:anchorId="162FFA37" wp14:editId="41A0F23A">
                 <wp:simplePos x="0" y="0"/>
                 <wp:positionH relativeFrom="column">
                   <wp:posOffset>2635250</wp:posOffset>
@@ -5210,7 +5214,7 @@
           </mc:Choice>
           <mc:Fallback>
             <w:pict>
-              <v:shape w14:anchorId="162FFA37" id="_x0000_s1031" type="#_x0000_t202" style="position:absolute;margin-left:207.5pt;margin-top:218.4pt;width:41pt;height:110.6pt;z-index:251697152;visibility:visible;mso-wrap-style:square;mso-width-percent:0;mso-height-percent:200;mso-wrap-distance-left:9pt;mso-wrap-distance-top:3.6pt;mso-wrap-distance-right:9pt;mso-wrap-distance-bottom:3.6pt;mso-position-horizontal:absolute;mso-position-horizontal-relative:text;mso-position-vertical:absolute;mso-position-vertical-relative:text;mso-width-percent:0;mso-height-percent:200;mso-width-relative:margin;mso-height-relative:margin;v-text-anchor:top" o:gfxdata="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" filled="f" stroked="f">
+              <v:shape w14:anchorId="162FFA37" id="_x0000_s1031" type="#_x0000_t202" style="position:absolute;margin-left:207.5pt;margin-top:218.4pt;width:41pt;height:110.6pt;z-index:251658253;visibility:visible;mso-wrap-style:square;mso-width-percent:0;mso-height-percent:200;mso-wrap-distance-left:9pt;mso-wrap-distance-top:3.6pt;mso-wrap-distance-right:9pt;mso-wrap-distance-bottom:3.6pt;mso-position-horizontal:absolute;mso-position-horizontal-relative:text;mso-position-vertical:absolute;mso-position-vertical-relative:text;mso-width-percent:0;mso-height-percent:200;mso-width-relative:margin;mso-height-relative:margin;v-text-anchor:top" o:gfxdata="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" filled="f" stroked="f">
                 <v:textbox style="mso-fit-shape-to-text:t">
                   <w:txbxContent>
                     <w:p>
@@ -5254,7 +5258,7 @@
         <mc:AlternateContent>
           <mc:Choice Requires="wps">
             <w:drawing>
-              <wp:anchor distT="45720" distB="45720" distL="114300" distR="114300" simplePos="0" relativeHeight="251695104" behindDoc="0" locked="0" layoutInCell="1" allowOverlap="1" wp14:anchorId="25E913A0" wp14:editId="6A3454F6">
+              <wp:anchor distT="45720" distB="45720" distL="114300" distR="114300" simplePos="0" relativeHeight="251658252" behindDoc="0" locked="0" layoutInCell="1" allowOverlap="1" wp14:anchorId="25E913A0" wp14:editId="6A3454F6">
                 <wp:simplePos x="0" y="0"/>
                 <wp:positionH relativeFrom="column">
                   <wp:posOffset>1587500</wp:posOffset>
@@ -5338,7 +5342,7 @@
           </mc:Choice>
           <mc:Fallback>
             <w:pict>
-              <v:shape w14:anchorId="25E913A0" id="_x0000_s1032" type="#_x0000_t202" style="position:absolute;margin-left:125pt;margin-top:122.1pt;width:41pt;height:110.6pt;z-index:251695104;visibility:visible;mso-wrap-style:square;mso-width-percent:0;mso-height-percent:200;mso-wrap-distance-left:9pt;mso-wrap-distance-top:3.6pt;mso-wrap-distance-right:9pt;mso-wrap-distance-bottom:3.6pt;mso-position-horizontal:absolute;mso-position-horizontal-relative:text;mso-position-vertical:absolute;mso-position-vertical-relative:text;mso-width-percent:0;mso-height-percent:200;mso-width-relative:margin;mso-height-relative:margin;v-text-anchor:top" o:gfxdata="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" filled="f" stroked="f">
+              <v:shape w14:anchorId="25E913A0" id="_x0000_s1032" type="#_x0000_t202" style="position:absolute;margin-left:125pt;margin-top:122.1pt;width:41pt;height:110.6pt;z-index:251658252;visibility:visible;mso-wrap-style:square;mso-width-percent:0;mso-height-percent:200;mso-wrap-distance-left:9pt;mso-wrap-distance-top:3.6pt;mso-wrap-distance-right:9pt;mso-wrap-distance-bottom:3.6pt;mso-position-horizontal:absolute;mso-position-horizontal-relative:text;mso-position-vertical:absolute;mso-position-vertical-relative:text;mso-width-percent:0;mso-height-percent:200;mso-width-relative:margin;mso-height-relative:margin;v-text-anchor:top" o:gfxdata="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" filled="f" stroked="f">
                 <v:textbox style="mso-fit-shape-to-text:t">
                   <w:txbxContent>
                     <w:p>
@@ -5382,7 +5386,7 @@
         <mc:AlternateContent>
           <mc:Choice Requires="wps">
             <w:drawing>
-              <wp:anchor distT="45720" distB="45720" distL="114300" distR="114300" simplePos="0" relativeHeight="251693056" behindDoc="0" locked="0" layoutInCell="1" allowOverlap="1" wp14:anchorId="65F880AD" wp14:editId="6425D855">
+              <wp:anchor distT="45720" distB="45720" distL="114300" distR="114300" simplePos="0" relativeHeight="251658251" behindDoc="0" locked="0" layoutInCell="1" allowOverlap="1" wp14:anchorId="65F880AD" wp14:editId="6425D855">
                 <wp:simplePos x="0" y="0"/>
                 <wp:positionH relativeFrom="column">
                   <wp:posOffset>2635250</wp:posOffset>
@@ -5458,7 +5462,7 @@
           </mc:Choice>
           <mc:Fallback>
             <w:pict>
-              <v:shape w14:anchorId="65F880AD" id="_x0000_s1033" type="#_x0000_t202" style="position:absolute;margin-left:207.5pt;margin-top:19.6pt;width:41pt;height:110.6pt;z-index:251693056;visibility:visible;mso-wrap-style:square;mso-width-percent:0;mso-height-percent:200;mso-wrap-distance-left:9pt;mso-wrap-distance-top:3.6pt;mso-wrap-distance-right:9pt;mso-wrap-distance-bottom:3.6pt;mso-position-horizontal:absolute;mso-position-horizontal-relative:text;mso-position-vertical:absolute;mso-position-vertical-relative:text;mso-width-percent:0;mso-height-percent:200;mso-width-relative:margin;mso-height-relative:margin;v-text-anchor:top" o:gfxdata="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" filled="f" stroked="f">
+              <v:shape w14:anchorId="65F880AD" id="_x0000_s1033" type="#_x0000_t202" style="position:absolute;margin-left:207.5pt;margin-top:19.6pt;width:41pt;height:110.6pt;z-index:251658251;visibility:visible;mso-wrap-style:square;mso-width-percent:0;mso-height-percent:200;mso-wrap-distance-left:9pt;mso-wrap-distance-top:3.6pt;mso-wrap-distance-right:9pt;mso-wrap-distance-bottom:3.6pt;mso-position-horizontal:absolute;mso-position-horizontal-relative:text;mso-position-vertical:absolute;mso-position-vertical-relative:text;mso-width-percent:0;mso-height-percent:200;mso-width-relative:margin;mso-height-relative:margin;v-text-anchor:top" o:gfxdata="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" filled="f" stroked="f">
                 <v:textbox style="mso-fit-shape-to-text:t">
                   <w:txbxContent>
                     <w:p>
@@ -5494,7 +5498,7 @@
         <mc:AlternateContent>
           <mc:Choice Requires="wps">
             <w:drawing>
-              <wp:anchor distT="45720" distB="45720" distL="114300" distR="114300" simplePos="0" relativeHeight="251691008" behindDoc="0" locked="0" layoutInCell="1" allowOverlap="1" wp14:anchorId="62B5E6D5" wp14:editId="3778537D">
+              <wp:anchor distT="45720" distB="45720" distL="114300" distR="114300" simplePos="0" relativeHeight="251658250" behindDoc="0" locked="0" layoutInCell="1" allowOverlap="1" wp14:anchorId="62B5E6D5" wp14:editId="3778537D">
                 <wp:simplePos x="0" y="0"/>
                 <wp:positionH relativeFrom="column">
                   <wp:posOffset>641350</wp:posOffset>
@@ -5571,7 +5575,7 @@
           </mc:Choice>
           <mc:Fallback>
             <w:pict>
-              <v:shape w14:anchorId="62B5E6D5" id="_x0000_s1034" type="#_x0000_t202" style="position:absolute;margin-left:50.5pt;margin-top:121.9pt;width:32pt;height:110.6pt;z-index:251691008;visibility:visible;mso-wrap-style:square;mso-width-percent:0;mso-height-percent:200;mso-wrap-distance-left:9pt;mso-wrap-distance-top:3.6pt;mso-wrap-distance-right:9pt;mso-wrap-distance-bottom:3.6pt;mso-position-horizontal:absolute;mso-position-horizontal-relative:text;mso-position-vertical:absolute;mso-position-vertical-relative:text;mso-width-percent:0;mso-height-percent:200;mso-width-relative:margin;mso-height-relative:margin;v-text-anchor:top" o:gfxdata="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" filled="f" stroked="f">
+              <v:shape w14:anchorId="62B5E6D5" id="_x0000_s1034" type="#_x0000_t202" style="position:absolute;margin-left:50.5pt;margin-top:121.9pt;width:32pt;height:110.6pt;z-index:251658250;visibility:visible;mso-wrap-style:square;mso-width-percent:0;mso-height-percent:200;mso-wrap-distance-left:9pt;mso-wrap-distance-top:3.6pt;mso-wrap-distance-right:9pt;mso-wrap-distance-bottom:3.6pt;mso-position-horizontal:absolute;mso-position-horizontal-relative:text;mso-position-vertical:absolute;mso-position-vertical-relative:text;mso-width-percent:0;mso-height-percent:200;mso-width-relative:margin;mso-height-relative:margin;v-text-anchor:top" o:gfxdata="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" filled="f" stroked="f">
                 <v:textbox style="mso-fit-shape-to-text:t">
                   <w:txbxContent>
                     <w:p>
@@ -5608,7 +5612,7 @@
         <mc:AlternateContent>
           <mc:Choice Requires="wps">
             <w:drawing>
-              <wp:anchor distT="45720" distB="45720" distL="114300" distR="114300" simplePos="0" relativeHeight="251688960" behindDoc="0" locked="0" layoutInCell="1" allowOverlap="1" wp14:anchorId="0DDAD6A5" wp14:editId="6C5274AE">
+              <wp:anchor distT="45720" distB="45720" distL="114300" distR="114300" simplePos="0" relativeHeight="251658249" behindDoc="0" locked="0" layoutInCell="1" allowOverlap="1" wp14:anchorId="0DDAD6A5" wp14:editId="6C5274AE">
                 <wp:simplePos x="0" y="0"/>
                 <wp:positionH relativeFrom="column">
                   <wp:posOffset>3752850</wp:posOffset>
@@ -5685,7 +5689,7 @@
           </mc:Choice>
           <mc:Fallback>
             <w:pict>
-              <v:shape w14:anchorId="0DDAD6A5" id="_x0000_s1035" type="#_x0000_t202" style="position:absolute;margin-left:295.5pt;margin-top:225.6pt;width:32pt;height:110.6pt;z-index:251688960;visibility:visible;mso-wrap-style:square;mso-width-percent:0;mso-height-percent:200;mso-wrap-distance-left:9pt;mso-wrap-distance-top:3.6pt;mso-wrap-distance-right:9pt;mso-wrap-distance-bottom:3.6pt;mso-position-horizontal:absolute;mso-position-horizontal-relative:text;mso-position-vertical:absolute;mso-position-vertical-relative:text;mso-width-percent:0;mso-height-percent:200;mso-width-relative:margin;mso-height-relative:margin;v-text-anchor:top" o:gfxdata="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" filled="f" stroked="f">
+              <v:shape w14:anchorId="0DDAD6A5" id="_x0000_s1035" type="#_x0000_t202" style="position:absolute;margin-left:295.5pt;margin-top:225.6pt;width:32pt;height:110.6pt;z-index:251658249;visibility:visible;mso-wrap-style:square;mso-width-percent:0;mso-height-percent:200;mso-wrap-distance-left:9pt;mso-wrap-distance-top:3.6pt;mso-wrap-distance-right:9pt;mso-wrap-distance-bottom:3.6pt;mso-position-horizontal:absolute;mso-position-horizontal-relative:text;mso-position-vertical:absolute;mso-position-vertical-relative:text;mso-width-percent:0;mso-height-percent:200;mso-width-relative:margin;mso-height-relative:margin;v-text-anchor:top" o:gfxdata="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" filled="f" stroked="f">
                 <v:textbox style="mso-fit-shape-to-text:t">
                   <w:txbxContent>
                     <w:p>
@@ -5722,7 +5726,7 @@
         <mc:AlternateContent>
           <mc:Choice Requires="wps">
             <w:drawing>
-              <wp:anchor distT="45720" distB="45720" distL="114300" distR="114300" simplePos="0" relativeHeight="251686912" behindDoc="0" locked="0" layoutInCell="1" allowOverlap="1" wp14:anchorId="0C876D1C" wp14:editId="7E24F173">
+              <wp:anchor distT="45720" distB="45720" distL="114300" distR="114300" simplePos="0" relativeHeight="251658248" behindDoc="0" locked="0" layoutInCell="1" allowOverlap="1" wp14:anchorId="0C876D1C" wp14:editId="7E24F173">
                 <wp:simplePos x="0" y="0"/>
                 <wp:positionH relativeFrom="column">
                   <wp:posOffset>584200</wp:posOffset>
@@ -5799,7 +5803,7 @@
           </mc:Choice>
           <mc:Fallback>
             <w:pict>
-              <v:shape w14:anchorId="0C876D1C" id="_x0000_s1036" type="#_x0000_t202" style="position:absolute;margin-left:46pt;margin-top:19.9pt;width:32pt;height:110.6pt;z-index:251686912;visibility:visible;mso-wrap-style:square;mso-width-percent:0;mso-height-percent:200;mso-wrap-distance-left:9pt;mso-wrap-distance-top:3.6pt;mso-wrap-distance-right:9pt;mso-wrap-distance-bottom:3.6pt;mso-position-horizontal:absolute;mso-position-horizontal-relative:text;mso-position-vertical:absolute;mso-position-vertical-relative:text;mso-width-percent:0;mso-height-percent:200;mso-width-relative:margin;mso-height-relative:margin;v-text-anchor:top" o:gfxdata="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" filled="f" stroked="f">
+              <v:shape w14:anchorId="0C876D1C" id="_x0000_s1036" type="#_x0000_t202" style="position:absolute;margin-left:46pt;margin-top:19.9pt;width:32pt;height:110.6pt;z-index:251658248;visibility:visible;mso-wrap-style:square;mso-width-percent:0;mso-height-percent:200;mso-wrap-distance-left:9pt;mso-wrap-distance-top:3.6pt;mso-wrap-distance-right:9pt;mso-wrap-distance-bottom:3.6pt;mso-position-horizontal:absolute;mso-position-horizontal-relative:text;mso-position-vertical:absolute;mso-position-vertical-relative:text;mso-width-percent:0;mso-height-percent:200;mso-width-relative:margin;mso-height-relative:margin;v-text-anchor:top" o:gfxdata="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" filled="f" stroked="f">
                 <v:textbox style="mso-fit-shape-to-text:t">
                   <w:txbxContent>
                     <w:p>
@@ -5836,7 +5840,7 @@
         <mc:AlternateContent>
           <mc:Choice Requires="wps">
             <w:drawing>
-              <wp:anchor distT="45720" distB="45720" distL="114300" distR="114300" simplePos="0" relativeHeight="251684864" behindDoc="0" locked="0" layoutInCell="1" allowOverlap="1" wp14:anchorId="5D13897F" wp14:editId="2D39566B">
+              <wp:anchor distT="45720" distB="45720" distL="114300" distR="114300" simplePos="0" relativeHeight="251658247" behindDoc="0" locked="0" layoutInCell="1" allowOverlap="1" wp14:anchorId="5D13897F" wp14:editId="2D39566B">
                 <wp:simplePos x="0" y="0"/>
                 <wp:positionH relativeFrom="column">
                   <wp:posOffset>3752850</wp:posOffset>
@@ -5913,7 +5917,7 @@
           </mc:Choice>
           <mc:Fallback>
             <w:pict>
-              <v:shape w14:anchorId="5D13897F" id="_x0000_s1037" type="#_x0000_t202" style="position:absolute;margin-left:295.5pt;margin-top:19.4pt;width:32pt;height:110.6pt;z-index:251684864;visibility:visible;mso-wrap-style:square;mso-width-percent:0;mso-height-percent:200;mso-wrap-distance-left:9pt;mso-wrap-distance-top:3.6pt;mso-wrap-distance-right:9pt;mso-wrap-distance-bottom:3.6pt;mso-position-horizontal:absolute;mso-position-horizontal-relative:text;mso-position-vertical:absolute;mso-position-vertical-relative:text;mso-width-percent:0;mso-height-percent:200;mso-width-relative:margin;mso-height-relative:margin;v-text-anchor:top" o:gfxdata="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" filled="f" stroked="f">
+              <v:shape w14:anchorId="5D13897F" id="_x0000_s1037" type="#_x0000_t202" style="position:absolute;margin-left:295.5pt;margin-top:19.4pt;width:32pt;height:110.6pt;z-index:251658247;visibility:visible;mso-wrap-style:square;mso-width-percent:0;mso-height-percent:200;mso-wrap-distance-left:9pt;mso-wrap-distance-top:3.6pt;mso-wrap-distance-right:9pt;mso-wrap-distance-bottom:3.6pt;mso-position-horizontal:absolute;mso-position-horizontal-relative:text;mso-position-vertical:absolute;mso-position-vertical-relative:text;mso-width-percent:0;mso-height-percent:200;mso-width-relative:margin;mso-height-relative:margin;v-text-anchor:top" o:gfxdata="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" filled="f" stroked="f">
                 <v:textbox style="mso-fit-shape-to-text:t">
                   <w:txbxContent>
                     <w:p>
@@ -5950,7 +5954,7 @@
         <mc:AlternateContent>
           <mc:Choice Requires="wps">
             <w:drawing>
-              <wp:anchor distT="45720" distB="45720" distL="114300" distR="114300" simplePos="0" relativeHeight="251682816" behindDoc="0" locked="0" layoutInCell="1" allowOverlap="1" wp14:anchorId="3416BA9B" wp14:editId="757755D7">
+              <wp:anchor distT="45720" distB="45720" distL="114300" distR="114300" simplePos="0" relativeHeight="251658246" behindDoc="0" locked="0" layoutInCell="1" allowOverlap="1" wp14:anchorId="3416BA9B" wp14:editId="757755D7">
                 <wp:simplePos x="0" y="0"/>
                 <wp:positionH relativeFrom="column">
                   <wp:posOffset>1587500</wp:posOffset>
@@ -6027,7 +6031,7 @@
           </mc:Choice>
           <mc:Fallback>
             <w:pict>
-              <v:shape w14:anchorId="3416BA9B" id="_x0000_s1038" type="#_x0000_t202" style="position:absolute;margin-left:125pt;margin-top:219.6pt;width:32pt;height:110.6pt;z-index:251682816;visibility:visible;mso-wrap-style:square;mso-width-percent:0;mso-height-percent:200;mso-wrap-distance-left:9pt;mso-wrap-distance-top:3.6pt;mso-wrap-distance-right:9pt;mso-wrap-distance-bottom:3.6pt;mso-position-horizontal:absolute;mso-position-horizontal-relative:text;mso-position-vertical:absolute;mso-position-vertical-relative:text;mso-width-percent:0;mso-height-percent:200;mso-width-relative:margin;mso-height-relative:margin;v-text-anchor:top" o:gfxdata="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" filled="f" stroked="f">
+              <v:shape w14:anchorId="3416BA9B" id="_x0000_s1038" type="#_x0000_t202" style="position:absolute;margin-left:125pt;margin-top:219.6pt;width:32pt;height:110.6pt;z-index:251658246;visibility:visible;mso-wrap-style:square;mso-width-percent:0;mso-height-percent:200;mso-wrap-distance-left:9pt;mso-wrap-distance-top:3.6pt;mso-wrap-distance-right:9pt;mso-wrap-distance-bottom:3.6pt;mso-position-horizontal:absolute;mso-position-horizontal-relative:text;mso-position-vertical:absolute;mso-position-vertical-relative:text;mso-width-percent:0;mso-height-percent:200;mso-width-relative:margin;mso-height-relative:margin;v-text-anchor:top" o:gfxdata="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" filled="f" stroked="f">
                 <v:textbox style="mso-fit-shape-to-text:t">
                   <w:txbxContent>
                     <w:p>
@@ -6064,7 +6068,7 @@
         <mc:AlternateContent>
           <mc:Choice Requires="wps">
             <w:drawing>
-              <wp:anchor distT="45720" distB="45720" distL="114300" distR="114300" simplePos="0" relativeHeight="251680768" behindDoc="0" locked="0" layoutInCell="1" allowOverlap="1" wp14:anchorId="19380695" wp14:editId="774025BF">
+              <wp:anchor distT="45720" distB="45720" distL="114300" distR="114300" simplePos="0" relativeHeight="251658245" behindDoc="0" locked="0" layoutInCell="1" allowOverlap="1" wp14:anchorId="19380695" wp14:editId="774025BF">
                 <wp:simplePos x="0" y="0"/>
                 <wp:positionH relativeFrom="column">
                   <wp:posOffset>2590800</wp:posOffset>
@@ -6141,7 +6145,7 @@
           </mc:Choice>
           <mc:Fallback>
             <w:pict>
-              <v:shape w14:anchorId="19380695" id="_x0000_s1039" type="#_x0000_t202" style="position:absolute;margin-left:204pt;margin-top:122.6pt;width:32pt;height:110.6pt;z-index:251680768;visibility:visible;mso-wrap-style:square;mso-width-percent:0;mso-height-percent:200;mso-wrap-distance-left:9pt;mso-wrap-distance-top:3.6pt;mso-wrap-distance-right:9pt;mso-wrap-distance-bottom:3.6pt;mso-position-horizontal:absolute;mso-position-horizontal-relative:text;mso-position-vertical:absolute;mso-position-vertical-relative:text;mso-width-percent:0;mso-height-percent:200;mso-width-relative:margin;mso-height-relative:margin;v-text-anchor:top" o:gfxdata="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" filled="f" stroked="f">
+              <v:shape w14:anchorId="19380695" id="_x0000_s1039" type="#_x0000_t202" style="position:absolute;margin-left:204pt;margin-top:122.6pt;width:32pt;height:110.6pt;z-index:251658245;visibility:visible;mso-wrap-style:square;mso-width-percent:0;mso-height-percent:200;mso-wrap-distance-left:9pt;mso-wrap-distance-top:3.6pt;mso-wrap-distance-right:9pt;mso-wrap-distance-bottom:3.6pt;mso-position-horizontal:absolute;mso-position-horizontal-relative:text;mso-position-vertical:absolute;mso-position-vertical-relative:text;mso-width-percent:0;mso-height-percent:200;mso-width-relative:margin;mso-height-relative:margin;v-text-anchor:top" o:gfxdata="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" filled="f" stroked="f">
                 <v:textbox style="mso-fit-shape-to-text:t">
                   <w:txbxContent>
                     <w:p>
@@ -6178,7 +6182,7 @@
         <mc:AlternateContent>
           <mc:Choice Requires="wps">
             <w:drawing>
-              <wp:anchor distT="45720" distB="45720" distL="114300" distR="114300" simplePos="0" relativeHeight="251678720" behindDoc="0" locked="0" layoutInCell="1" allowOverlap="1" wp14:anchorId="1ADBB2AE" wp14:editId="43BCC179">
+              <wp:anchor distT="45720" distB="45720" distL="114300" distR="114300" simplePos="0" relativeHeight="251658244" behindDoc="0" locked="0" layoutInCell="1" allowOverlap="1" wp14:anchorId="1ADBB2AE" wp14:editId="43BCC179">
                 <wp:simplePos x="0" y="0"/>
                 <wp:positionH relativeFrom="column">
                   <wp:posOffset>584200</wp:posOffset>
@@ -6255,7 +6259,7 @@
           </mc:Choice>
           <mc:Fallback>
             <w:pict>
-              <v:shape w14:anchorId="1ADBB2AE" id="_x0000_s1040" type="#_x0000_t202" style="position:absolute;margin-left:46pt;margin-top:219.6pt;width:32pt;height:110.6pt;z-index:251678720;visibility:visible;mso-wrap-style:square;mso-width-percent:0;mso-height-percent:200;mso-wrap-distance-left:9pt;mso-wrap-distance-top:3.6pt;mso-wrap-distance-right:9pt;mso-wrap-distance-bottom:3.6pt;mso-position-horizontal:absolute;mso-position-horizontal-relative:text;mso-position-vertical:absolute;mso-position-vertical-relative:text;mso-width-percent:0;mso-height-percent:200;mso-width-relative:margin;mso-height-relative:margin;v-text-anchor:top" o:gfxdata="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" filled="f" stroked="f">
+              <v:shape w14:anchorId="1ADBB2AE" id="_x0000_s1040" type="#_x0000_t202" style="position:absolute;margin-left:46pt;margin-top:219.6pt;width:32pt;height:110.6pt;z-index:251658244;visibility:visible;mso-wrap-style:square;mso-width-percent:0;mso-height-percent:200;mso-wrap-distance-left:9pt;mso-wrap-distance-top:3.6pt;mso-wrap-distance-right:9pt;mso-wrap-distance-bottom:3.6pt;mso-position-horizontal:absolute;mso-position-horizontal-relative:text;mso-position-vertical:absolute;mso-position-vertical-relative:text;mso-width-percent:0;mso-height-percent:200;mso-width-relative:margin;mso-height-relative:margin;v-text-anchor:top" o:gfxdata="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" filled="f" stroked="f">
                 <v:textbox style="mso-fit-shape-to-text:t">
                   <w:txbxContent>
                     <w:p>
@@ -6292,7 +6296,7 @@
         <mc:AlternateContent>
           <mc:Choice Requires="wps">
             <w:drawing>
-              <wp:anchor distT="45720" distB="45720" distL="114300" distR="114300" simplePos="0" relativeHeight="251676672" behindDoc="0" locked="0" layoutInCell="1" allowOverlap="1" wp14:anchorId="6AFAB4A0" wp14:editId="611EDE40">
+              <wp:anchor distT="45720" distB="45720" distL="114300" distR="114300" simplePos="0" relativeHeight="251658243" behindDoc="0" locked="0" layoutInCell="1" allowOverlap="1" wp14:anchorId="6AFAB4A0" wp14:editId="611EDE40">
                 <wp:simplePos x="0" y="0"/>
                 <wp:positionH relativeFrom="column">
                   <wp:posOffset>1549400</wp:posOffset>
@@ -6367,7 +6371,7 @@
           </mc:Choice>
           <mc:Fallback>
             <w:pict>
-              <v:shape w14:anchorId="6AFAB4A0" id="_x0000_s1041" type="#_x0000_t202" style="position:absolute;margin-left:122pt;margin-top:17.6pt;width:32pt;height:110.6pt;z-index:251676672;visibility:visible;mso-wrap-style:square;mso-width-percent:0;mso-height-percent:200;mso-wrap-distance-left:9pt;mso-wrap-distance-top:3.6pt;mso-wrap-distance-right:9pt;mso-wrap-distance-bottom:3.6pt;mso-position-horizontal:absolute;mso-position-horizontal-relative:text;mso-position-vertical:absolute;mso-position-vertical-relative:text;mso-width-percent:0;mso-height-percent:200;mso-width-relative:margin;mso-height-relative:margin;v-text-anchor:top" o:gfxdata="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" filled="f" stroked="f">
+              <v:shape w14:anchorId="6AFAB4A0" id="_x0000_s1041" type="#_x0000_t202" style="position:absolute;margin-left:122pt;margin-top:17.6pt;width:32pt;height:110.6pt;z-index:251658243;visibility:visible;mso-wrap-style:square;mso-width-percent:0;mso-height-percent:200;mso-wrap-distance-left:9pt;mso-wrap-distance-top:3.6pt;mso-wrap-distance-right:9pt;mso-wrap-distance-bottom:3.6pt;mso-position-horizontal:absolute;mso-position-horizontal-relative:text;mso-position-vertical:absolute;mso-position-vertical-relative:text;mso-width-percent:0;mso-height-percent:200;mso-width-relative:margin;mso-height-relative:margin;v-text-anchor:top" o:gfxdata="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" filled="f" stroked="f">
                 <v:textbox style="mso-fit-shape-to-text:t">
                   <w:txbxContent>
                     <w:p>
@@ -6400,9 +6404,9 @@
           <w:noProof/>
         </w:rPr>
         <w:drawing>
-          <wp:inline distT="0" distB="0" distL="0" distR="0" wp14:anchorId="30102019" wp14:editId="75AC3AF1">
+          <wp:inline distT="0" distB="0" distL="0" distR="0" wp14:anchorId="30102019" wp14:editId="72CBCBFF">
             <wp:extent cx="4448796" cy="4163006"/>
-            <wp:effectExtent l="0" t="0" r="9525" b="9525"/>
+            <wp:effectExtent l="0" t="0" r="1270" b="8890"/>
             <wp:docPr id="350831192" name="Picture 1"/>
             <wp:cNvGraphicFramePr>
               <a:graphicFrameLocks xmlns:a="http://schemas.openxmlformats.org/drawingml/2006/main" noChangeAspect="1"/>
@@ -6451,16 +6455,7 @@
           <w:b/>
           <w:bCs/>
         </w:rPr>
-        <w:lastRenderedPageBreak/>
-        <w:t>Direction puzzle</w:t>
-      </w:r>
-      <w:r>
-        <w:rPr>
-          <w:rFonts w:ascii="Calibri" w:eastAsia="Calibri" w:hAnsi="Calibri" w:cs="Calibri"/>
-          <w:b/>
-          <w:bCs/>
-        </w:rPr>
-        <w:t>:</w:t>
+        <w:t>Direction puzzle:</w:t>
       </w:r>
     </w:p>
     <w:p>
@@ -7332,99 +7327,51 @@
           <w:b/>
           <w:bCs/>
         </w:rPr>
-        <w:t>R</w:t>
-      </w:r>
-      <w:r>
+        <w:t>Riddle puzzle:</w:t>
+      </w:r>
+    </w:p>
+    <w:p>
+      <w:pPr>
+        <w:rPr>
+          <w:rFonts w:ascii="Calibri" w:eastAsia="Calibri" w:hAnsi="Calibri" w:cs="Calibri"/>
+        </w:rPr>
+      </w:pPr>
+      <w:r>
+        <w:rPr>
+          <w:rFonts w:ascii="Calibri" w:eastAsia="Calibri" w:hAnsi="Calibri" w:cs="Calibri"/>
+        </w:rPr>
+        <w:t>The owl riddle is: What has holes but still sings?</w:t>
+      </w:r>
+    </w:p>
+    <w:p>
+      <w:pPr>
+        <w:rPr>
+          <w:rFonts w:ascii="Calibri" w:eastAsia="Calibri" w:hAnsi="Calibri" w:cs="Calibri"/>
+        </w:rPr>
+      </w:pPr>
+      <w:r>
+        <w:rPr>
+          <w:rFonts w:ascii="Calibri" w:eastAsia="Calibri" w:hAnsi="Calibri" w:cs="Calibri"/>
+        </w:rPr>
+        <w:t>The answer is: Flute</w:t>
+      </w:r>
+    </w:p>
+    <w:p>
+      <w:pPr>
+        <w:spacing w:before="240"/>
         <w:rPr>
           <w:rFonts w:ascii="Calibri" w:eastAsia="Calibri" w:hAnsi="Calibri" w:cs="Calibri"/>
           <w:b/>
           <w:bCs/>
         </w:rPr>
-        <w:t>iddle puzzle</w:t>
-      </w:r>
+      </w:pPr>
       <w:r>
         <w:rPr>
           <w:rFonts w:ascii="Calibri" w:eastAsia="Calibri" w:hAnsi="Calibri" w:cs="Calibri"/>
           <w:b/>
           <w:bCs/>
         </w:rPr>
-        <w:t>:</w:t>
-      </w:r>
-    </w:p>
-    <w:p>
-      <w:pPr>
-        <w:rPr>
-          <w:rFonts w:ascii="Calibri" w:eastAsia="Calibri" w:hAnsi="Calibri" w:cs="Calibri"/>
-        </w:rPr>
-      </w:pPr>
-      <w:r>
-        <w:rPr>
-          <w:rFonts w:ascii="Calibri" w:eastAsia="Calibri" w:hAnsi="Calibri" w:cs="Calibri"/>
-        </w:rPr>
-        <w:t>The owl riddle is: What has holes but still sings?</w:t>
-      </w:r>
-    </w:p>
-    <w:p>
-      <w:pPr>
-        <w:rPr>
-          <w:rFonts w:ascii="Calibri" w:eastAsia="Calibri" w:hAnsi="Calibri" w:cs="Calibri"/>
-        </w:rPr>
-      </w:pPr>
-      <w:r>
-        <w:rPr>
-          <w:rFonts w:ascii="Calibri" w:eastAsia="Calibri" w:hAnsi="Calibri" w:cs="Calibri"/>
-        </w:rPr>
-        <w:t>The answer is: Flute</w:t>
-      </w:r>
-    </w:p>
-    <w:p>
-      <w:pPr>
-        <w:spacing w:before="240"/>
-        <w:rPr>
-          <w:rFonts w:ascii="Calibri" w:eastAsia="Calibri" w:hAnsi="Calibri" w:cs="Calibri"/>
-          <w:b/>
-          <w:bCs/>
-        </w:rPr>
-      </w:pPr>
-      <w:r>
-        <w:rPr>
-          <w:rFonts w:ascii="Calibri" w:eastAsia="Calibri" w:hAnsi="Calibri" w:cs="Calibri"/>
-          <w:b/>
-          <w:bCs/>
-        </w:rPr>
-        <w:t>W</w:t>
-      </w:r>
-      <w:r>
-        <w:rPr>
-          <w:rFonts w:ascii="Calibri" w:eastAsia="Calibri" w:hAnsi="Calibri" w:cs="Calibri"/>
-          <w:b/>
-          <w:bCs/>
-        </w:rPr>
-        <w:t xml:space="preserve">ord </w:t>
-      </w:r>
-      <w:r>
-        <w:rPr>
-          <w:rFonts w:ascii="Calibri" w:eastAsia="Calibri" w:hAnsi="Calibri" w:cs="Calibri"/>
-          <w:b/>
-          <w:bCs/>
-        </w:rPr>
-        <w:t>G</w:t>
-      </w:r>
-      <w:r>
-        <w:rPr>
-          <w:rFonts w:ascii="Calibri" w:eastAsia="Calibri" w:hAnsi="Calibri" w:cs="Calibri"/>
-          <w:b/>
-          <w:bCs/>
-        </w:rPr>
-        <w:t>uessing</w:t>
-      </w:r>
-      <w:r>
-        <w:rPr>
-          <w:rFonts w:ascii="Calibri" w:eastAsia="Calibri" w:hAnsi="Calibri" w:cs="Calibri"/>
-          <w:b/>
-          <w:bCs/>
-        </w:rPr>
-        <w:t>:</w:t>
+        <w:t>Word Guessing:</w:t>
       </w:r>
     </w:p>
     <w:p>
@@ -7518,7 +7465,6 @@
           <w:sz w:val="26"/>
           <w:szCs w:val="26"/>
         </w:rPr>
-        <w:lastRenderedPageBreak/>
         <w:t>Path 3 Requirement</w:t>
       </w:r>
     </w:p>
@@ -8462,7 +8408,6 @@
           <w:sz w:val="26"/>
           <w:szCs w:val="26"/>
         </w:rPr>
-        <w:lastRenderedPageBreak/>
         <w:t>Puzzle Requirement</w:t>
       </w:r>
     </w:p>
@@ -9340,7 +9285,6 @@
         <w:rPr>
           <w:rFonts w:ascii="Calibri" w:eastAsia="Calibri" w:hAnsi="Calibri" w:cs="Calibri"/>
         </w:rPr>
-        <w:lastRenderedPageBreak/>
         <w:t>The text box should be used for:</w:t>
       </w:r>
     </w:p>
@@ -10142,7 +10086,6 @@
         <w:rPr>
           <w:rFonts w:ascii="Calibri" w:eastAsia="Calibri" w:hAnsi="Calibri" w:cs="Calibri"/>
         </w:rPr>
-        <w:lastRenderedPageBreak/>
         <w:t>Examples of animation include:</w:t>
       </w:r>
     </w:p>
@@ -11282,7 +11225,6 @@
           <w:sz w:val="26"/>
           <w:szCs w:val="26"/>
         </w:rPr>
-        <w:lastRenderedPageBreak/>
         <w:t>MVC Requirement</w:t>
       </w:r>
     </w:p>
@@ -11678,7 +11620,7 @@
         <mc:AlternateContent>
           <mc:Choice Requires="wpg">
             <w:drawing>
-              <wp:anchor distT="0" distB="0" distL="114300" distR="114300" simplePos="0" relativeHeight="251666432" behindDoc="0" locked="0" layoutInCell="1" allowOverlap="1" wp14:anchorId="171DFF5C" wp14:editId="241CB6A3">
+              <wp:anchor distT="0" distB="0" distL="114300" distR="114300" simplePos="0" relativeHeight="251658240" behindDoc="0" locked="0" layoutInCell="1" allowOverlap="1" wp14:anchorId="171DFF5C" wp14:editId="241CB6A3">
                 <wp:simplePos x="0" y="0"/>
                 <wp:positionH relativeFrom="column">
                   <wp:posOffset>128712</wp:posOffset>
@@ -12161,7 +12103,7 @@
           </mc:Choice>
           <mc:Fallback>
             <w:pict>
-              <v:group w14:anchorId="171DFF5C" id="Group 26" o:spid="_x0000_s1042" style="position:absolute;margin-left:10.15pt;margin-top:10.4pt;width:449.5pt;height:113pt;z-index:251666432;mso-width-relative:margin" coordsize="57084,14351" o:gfxdata="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">
+              <v:group w14:anchorId="171DFF5C" id="Group 26" o:spid="_x0000_s1042" style="position:absolute;margin-left:10.15pt;margin-top:10.4pt;width:449.5pt;height:113pt;z-index:251658240;mso-width-relative:margin" coordsize="57084,14351" o:gfxdata="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">
                 <v:group id="Group 2" o:spid="_x0000_s1043" style="position:absolute;top:2623;width:13144;height:8763" coordorigin=",2226" coordsize="13144,8763" o:gfxdata="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">
                   <v:rect id="Rectangle 1" o:spid="_x0000_s1044" style="position:absolute;top:2226;width:13144;height:8763;visibility:visible;mso-wrap-style:square;v-text-anchor:middle" o:gfxdata="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" fillcolor="#4f81bd [3204]" strokecolor="#4579b8 [3044]">
                     <v:fill color2="#a7bfde [1620]" rotate="t" angle="180" focus="100%" type="gradient">
@@ -12663,7 +12605,6 @@
           <w:sz w:val="26"/>
           <w:szCs w:val="26"/>
         </w:rPr>
-        <w:lastRenderedPageBreak/>
         <w:t>Success Criteria</w:t>
       </w:r>
     </w:p>
@@ -14180,8 +14121,6 @@
   <w:style w:type="table" w:default="1" w:styleId="TableNormal">
     <w:name w:val="Normal Table"/>
     <w:uiPriority w:val="99"/>
-    <w:semiHidden/>
-    <w:unhideWhenUsed/>
     <w:tblPr>
       <w:tblInd w:w="0" w:type="dxa"/>
       <w:tblCellMar>

</xml_diff>

<commit_message>
added timer, still fixing some minor issues and ready to submit the final version by using jar file
</commit_message>
<xml_diff>
--- a/Doc/ICS4U1 CPT Requirements Document.docx
+++ b/Doc/ICS4U1 CPT Requirements Document.docx
@@ -308,6 +308,7 @@
           <w:sz w:val="34"/>
           <w:szCs w:val="34"/>
         </w:rPr>
+        <w:lastRenderedPageBreak/>
         <w:t>Project Overview</w:t>
       </w:r>
     </w:p>
@@ -1334,9 +1335,9 @@
               </wp:anchor>
             </w:drawing>
           </mc:Choice>
-          <mc:Fallback xmlns:arto="http://schemas.microsoft.com/office/word/2006/arto">
+          <mc:Fallback>
             <w:pict>
-              <v:rect w14:anchorId="6177B70B" id="Rectangle 5" o:spid="_x0000_s1026" style="position:absolute;margin-left:8.5pt;margin-top:20.4pt;width:258pt;height:120.5pt;z-index:251667456;visibility:visible;mso-wrap-style:square;mso-width-percent:0;mso-height-percent:0;mso-wrap-distance-left:9pt;mso-wrap-distance-top:0;mso-wrap-distance-right:9pt;mso-wrap-distance-bottom:0;mso-position-horizontal:absolute;mso-position-horizontal-relative:text;mso-position-vertical:absolute;mso-position-vertical-relative:text;mso-width-percent:0;mso-height-percent:0;mso-width-relative:margin;mso-height-relative:margin;v-text-anchor:middle" o:gfxdata="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" fillcolor="gray [1616]" strokecolor="black [3040]">
+              <v:rect w14:anchorId="3F1781A8" id="Rectangle 5" o:spid="_x0000_s1026" style="position:absolute;margin-left:8.5pt;margin-top:20.4pt;width:258pt;height:120.5pt;z-index:251658241;visibility:visible;mso-wrap-style:square;mso-width-percent:0;mso-height-percent:0;mso-wrap-distance-left:9pt;mso-wrap-distance-top:0;mso-wrap-distance-right:9pt;mso-wrap-distance-bottom:0;mso-position-horizontal:absolute;mso-position-horizontal-relative:text;mso-position-vertical:absolute;mso-position-vertical-relative:text;mso-width-percent:0;mso-height-percent:0;mso-width-relative:margin;mso-height-relative:margin;v-text-anchor:middle" o:gfxdata="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" fillcolor="gray [1616]" strokecolor="black [3040]">
                 <v:fill color2="#d9d9d9 [496]" rotate="t" angle="180" colors="0 #bcbcbc;22938f #d0d0d0;1 #ededed" focus="100%" type="gradient"/>
                 <v:shadow on="t" color="black" opacity="24903f" origin=",.5" offset="0,.55556mm"/>
               </v:rect>
@@ -1431,6 +1432,7 @@
           <w:sz w:val="26"/>
           <w:szCs w:val="26"/>
         </w:rPr>
+        <w:lastRenderedPageBreak/>
         <w:t>Starting Screen Requirement</w:t>
       </w:r>
     </w:p>
@@ -1804,19 +1806,11 @@
                 <w:rFonts w:ascii="Calibri" w:eastAsia="Calibri" w:hAnsi="Calibri" w:cs="Calibri"/>
               </w:rPr>
             </w:pPr>
-            <w:proofErr w:type="gramStart"/>
-            <w:r>
-              <w:rPr>
-                <w:rFonts w:ascii="Calibri" w:eastAsia="Calibri" w:hAnsi="Calibri" w:cs="Calibri"/>
-              </w:rPr>
-              <w:t>Allows</w:t>
-            </w:r>
-            <w:proofErr w:type="gramEnd"/>
-            <w:r>
-              <w:rPr>
-                <w:rFonts w:ascii="Calibri" w:eastAsia="Calibri" w:hAnsi="Calibri" w:cs="Calibri"/>
-              </w:rPr>
-              <w:t xml:space="preserve"> players to connect before or during gameplay</w:t>
+            <w:r>
+              <w:rPr>
+                <w:rFonts w:ascii="Calibri" w:eastAsia="Calibri" w:hAnsi="Calibri" w:cs="Calibri"/>
+              </w:rPr>
+              <w:t>Allows players to connect before or during gameplay</w:t>
             </w:r>
           </w:p>
         </w:tc>
@@ -2064,6 +2058,7 @@
         <w:rPr>
           <w:rFonts w:ascii="Calibri" w:eastAsia="Calibri" w:hAnsi="Calibri" w:cs="Calibri"/>
         </w:rPr>
+        <w:lastRenderedPageBreak/>
         <w:t>The network panel should include:</w:t>
       </w:r>
     </w:p>
@@ -2283,21 +2278,7 @@
               <w:rPr>
                 <w:rFonts w:ascii="Calibri" w:eastAsia="Calibri" w:hAnsi="Calibri" w:cs="Calibri"/>
               </w:rPr>
-              <w:t xml:space="preserve">Connect </w:t>
-            </w:r>
-            <w:proofErr w:type="gramStart"/>
-            <w:r>
-              <w:rPr>
-                <w:rFonts w:ascii="Calibri" w:eastAsia="Calibri" w:hAnsi="Calibri" w:cs="Calibri"/>
-              </w:rPr>
-              <w:t>to</w:t>
-            </w:r>
-            <w:proofErr w:type="gramEnd"/>
-            <w:r>
-              <w:rPr>
-                <w:rFonts w:ascii="Calibri" w:eastAsia="Calibri" w:hAnsi="Calibri" w:cs="Calibri"/>
-              </w:rPr>
-              <w:t xml:space="preserve"> </w:t>
+              <w:t xml:space="preserve">Connect to </w:t>
             </w:r>
             <w:r>
               <w:rPr>
@@ -3043,7 +3024,8 @@
       <w:pPr>
         <w:spacing w:before="240" w:after="240"/>
         <w:rPr>
-          <w:rFonts w:ascii="Calibri" w:eastAsia="Calibri" w:hAnsi="Calibri" w:cs="Calibri"/>
+          <w:rFonts w:ascii="Calibri" w:hAnsi="Calibri" w:cs="Calibri"/>
+          <w:lang w:val="en-US"/>
         </w:rPr>
       </w:pPr>
       <w:r>
@@ -3081,6 +3063,18 @@
           <w:rFonts w:ascii="Calibri" w:eastAsia="Calibri" w:hAnsi="Calibri" w:cs="Calibri"/>
         </w:rPr>
         <w:t>.</w:t>
+      </w:r>
+      <w:r>
+        <w:rPr>
+          <w:rFonts w:ascii="Calibri" w:hAnsi="Calibri" w:cs="Calibri" w:hint="eastAsia"/>
+        </w:rPr>
+        <w:t xml:space="preserve"> </w:t>
+      </w:r>
+      <w:r>
+        <w:rPr>
+          <w:rFonts w:ascii="Calibri" w:hAnsi="Calibri" w:cs="Calibri"/>
+        </w:rPr>
+        <w:t>Because this is a multiplayer game, path completion is shared among all players. For example, if Player 1 completes Path 1, the game will automatically mark Path 1 as completed for Player 2 as well and notify both players of the completion.</w:t>
       </w:r>
     </w:p>
     <w:p>
@@ -3991,56 +3985,12 @@
           <w:rFonts w:ascii="Calibri" w:eastAsia="Calibri" w:hAnsi="Calibri" w:cs="Calibri"/>
         </w:rPr>
       </w:pPr>
-      <w:proofErr w:type="spellStart"/>
-      <w:r>
-        <w:rPr>
-          <w:rFonts w:ascii="Calibri" w:eastAsia="Calibri" w:hAnsi="Calibri" w:cs="Calibri"/>
-        </w:rPr>
-        <w:t>objectName</w:t>
-      </w:r>
-      <w:proofErr w:type="spellEnd"/>
-      <w:r>
-        <w:rPr>
-          <w:rFonts w:ascii="Calibri" w:eastAsia="Calibri" w:hAnsi="Calibri" w:cs="Calibri"/>
-        </w:rPr>
-        <w:t xml:space="preserve">, x, y, </w:t>
-      </w:r>
-      <w:proofErr w:type="spellStart"/>
-      <w:r>
-        <w:rPr>
-          <w:rFonts w:ascii="Calibri" w:eastAsia="Calibri" w:hAnsi="Calibri" w:cs="Calibri"/>
-        </w:rPr>
-        <w:t>puzzleType</w:t>
-      </w:r>
-      <w:proofErr w:type="spellEnd"/>
-      <w:r>
-        <w:rPr>
-          <w:rFonts w:ascii="Calibri" w:eastAsia="Calibri" w:hAnsi="Calibri" w:cs="Calibri"/>
-        </w:rPr>
-        <w:t xml:space="preserve">, answer, </w:t>
-      </w:r>
-      <w:proofErr w:type="spellStart"/>
-      <w:r>
-        <w:rPr>
-          <w:rFonts w:ascii="Calibri" w:eastAsia="Calibri" w:hAnsi="Calibri" w:cs="Calibri"/>
-        </w:rPr>
-        <w:t>clueText</w:t>
-      </w:r>
-      <w:proofErr w:type="spellEnd"/>
-      <w:r>
-        <w:rPr>
-          <w:rFonts w:ascii="Calibri" w:eastAsia="Calibri" w:hAnsi="Calibri" w:cs="Calibri"/>
-        </w:rPr>
-        <w:t xml:space="preserve">, </w:t>
-      </w:r>
-      <w:proofErr w:type="spellStart"/>
-      <w:r>
-        <w:rPr>
-          <w:rFonts w:ascii="Calibri" w:eastAsia="Calibri" w:hAnsi="Calibri" w:cs="Calibri"/>
-        </w:rPr>
-        <w:t>nextObject</w:t>
-      </w:r>
-      <w:proofErr w:type="spellEnd"/>
+      <w:r>
+        <w:rPr>
+          <w:rFonts w:ascii="Calibri" w:eastAsia="Calibri" w:hAnsi="Calibri" w:cs="Calibri"/>
+        </w:rPr>
+        <w:t>objectName, x, y, puzzleType, answer, clueText, nextObject</w:t>
+      </w:r>
     </w:p>
     <w:p>
       <w:pPr>
@@ -4121,6 +4071,12 @@
         </w:rPr>
         <w:t>Path 1 focuses on the deer, hunter, and forest evidence. The player must click objects in a sequence and solve two main puzzles.</w:t>
       </w:r>
+      <w:r>
+        <w:rPr>
+          <w:rFonts w:ascii="Calibri" w:eastAsia="Calibri" w:hAnsi="Calibri" w:cs="Calibri"/>
+        </w:rPr>
+        <w:t xml:space="preserve"> If the player clicks a wrong object, re-click the click order again to complete it.</w:t>
+      </w:r>
     </w:p>
     <w:p>
       <w:pPr>
@@ -4141,7 +4097,19 @@
         <w:rPr>
           <w:rFonts w:ascii="Calibri" w:eastAsia="Calibri" w:hAnsi="Calibri" w:cs="Calibri"/>
         </w:rPr>
-        <w:t xml:space="preserve"> Deer Body → Rifle → Bag → Hare and Card Puzzle → Tree Burrow → Squirrel → Deer Standing and Direction Puzzle</w:t>
+        <w:t xml:space="preserve"> Deer Body → Rifle → Bag → Hare → </w:t>
+      </w:r>
+      <w:r>
+        <w:rPr>
+          <w:rFonts w:ascii="Calibri" w:eastAsia="Calibri" w:hAnsi="Calibri" w:cs="Calibri"/>
+        </w:rPr>
+        <w:t>Hare’s small hat (only show if the card game is completed)</w:t>
+      </w:r>
+      <w:r>
+        <w:rPr>
+          <w:rFonts w:ascii="Calibri" w:eastAsia="Calibri" w:hAnsi="Calibri" w:cs="Calibri"/>
+        </w:rPr>
+        <w:t xml:space="preserve"> → Tree Burrow → Squirrel → Deer Standing</w:t>
       </w:r>
     </w:p>
     <w:p>
@@ -4970,21 +4938,7 @@
         <w:rPr>
           <w:rFonts w:ascii="Calibri" w:eastAsia="Calibri" w:hAnsi="Calibri" w:cs="Calibri"/>
         </w:rPr>
-        <w:t xml:space="preserve">The diagram below illustrates the correct order of the cards. The sequence corresponds to </w:t>
-      </w:r>
-      <w:proofErr w:type="gramStart"/>
-      <w:r>
-        <w:rPr>
-          <w:rFonts w:ascii="Calibri" w:eastAsia="Calibri" w:hAnsi="Calibri" w:cs="Calibri"/>
-        </w:rPr>
-        <w:t>the numbers</w:t>
-      </w:r>
-      <w:proofErr w:type="gramEnd"/>
-      <w:r>
-        <w:rPr>
-          <w:rFonts w:ascii="Calibri" w:eastAsia="Calibri" w:hAnsi="Calibri" w:cs="Calibri"/>
-        </w:rPr>
-        <w:t xml:space="preserve"> 1 through 10, with each number represented by a unique symbol.</w:t>
+        <w:t>The diagram below illustrates the correct order of the cards. The sequence corresponds to the numbers 1 through 10, with each number represented by a unique symbol.</w:t>
       </w:r>
     </w:p>
     <w:p>
@@ -6672,6 +6626,18 @@
         </w:rPr>
         <w:t>Path 2 focuses on the strange magical side of the forest. The player interacts with a nest, owl, clue, statues, and flute.</w:t>
       </w:r>
+      <w:r>
+        <w:rPr>
+          <w:rFonts w:ascii="Calibri" w:eastAsia="Calibri" w:hAnsi="Calibri" w:cs="Calibri"/>
+        </w:rPr>
+        <w:t xml:space="preserve"> If the player clicks a wrong object, re-click the </w:t>
+      </w:r>
+      <w:r>
+        <w:rPr>
+          <w:rFonts w:ascii="Calibri" w:eastAsia="Calibri" w:hAnsi="Calibri" w:cs="Calibri"/>
+        </w:rPr>
+        <w:t>click order again to complete it.</w:t>
+      </w:r>
     </w:p>
     <w:p>
       <w:pPr>
@@ -7422,21 +7388,7 @@
         <w:rPr>
           <w:rFonts w:ascii="Calibri" w:eastAsia="Calibri" w:hAnsi="Calibri" w:cs="Calibri"/>
         </w:rPr>
-        <w:t xml:space="preserve">The program should ignore letter </w:t>
-      </w:r>
-      <w:proofErr w:type="gramStart"/>
-      <w:r>
-        <w:rPr>
-          <w:rFonts w:ascii="Calibri" w:eastAsia="Calibri" w:hAnsi="Calibri" w:cs="Calibri"/>
-        </w:rPr>
-        <w:t>case</w:t>
-      </w:r>
-      <w:proofErr w:type="gramEnd"/>
-      <w:r>
-        <w:rPr>
-          <w:rFonts w:ascii="Calibri" w:eastAsia="Calibri" w:hAnsi="Calibri" w:cs="Calibri"/>
-        </w:rPr>
-        <w:t xml:space="preserve"> when verifying the answer.</w:t>
+        <w:t>The program should ignore letter case when verifying the answer.</w:t>
       </w:r>
     </w:p>
     <w:p>
@@ -7480,6 +7432,12 @@
           <w:rFonts w:ascii="Calibri" w:eastAsia="Calibri" w:hAnsi="Calibri" w:cs="Calibri"/>
         </w:rPr>
         <w:t>Path 3 focuses on abandoned human objects and clues about someone who was in the forest before. The player investigates a campfire, radio, jacket, phone, journal, knife, and flower.</w:t>
+      </w:r>
+      <w:r>
+        <w:rPr>
+          <w:rFonts w:ascii="Calibri" w:eastAsia="Calibri" w:hAnsi="Calibri" w:cs="Calibri"/>
+        </w:rPr>
+        <w:t xml:space="preserve"> If the player clicks a wrong object, re-click the click order again to complete it.</w:t>
       </w:r>
     </w:p>
     <w:p>
@@ -10050,21 +10008,7 @@
         <w:rPr>
           <w:rFonts w:ascii="Calibri" w:eastAsia="Calibri" w:hAnsi="Calibri" w:cs="Calibri"/>
         </w:rPr>
-        <w:t xml:space="preserve">The game must use animation with a 60 FPS timer or repaint loop. Animation is used for </w:t>
-      </w:r>
-      <w:proofErr w:type="gramStart"/>
-      <w:r>
-        <w:rPr>
-          <w:rFonts w:ascii="Calibri" w:eastAsia="Calibri" w:hAnsi="Calibri" w:cs="Calibri"/>
-        </w:rPr>
-        <w:t>the game</w:t>
-      </w:r>
-      <w:proofErr w:type="gramEnd"/>
-      <w:r>
-        <w:rPr>
-          <w:rFonts w:ascii="Calibri" w:eastAsia="Calibri" w:hAnsi="Calibri" w:cs="Calibri"/>
-        </w:rPr>
-        <w:t xml:space="preserve"> panels and some puzzle message movements.</w:t>
+        <w:t>The game must use animation with a 60 FPS timer or repaint loop. Animation is used for the game panels and some puzzle message movements.</w:t>
       </w:r>
     </w:p>
     <w:p>
@@ -10435,16 +10379,8 @@
               <w:rPr>
                 <w:rFonts w:ascii="Calibri" w:eastAsia="Calibri" w:hAnsi="Calibri" w:cs="Calibri"/>
               </w:rPr>
-              <w:t xml:space="preserve">Redrawn through </w:t>
-            </w:r>
-            <w:proofErr w:type="spellStart"/>
-            <w:r>
-              <w:rPr>
-                <w:rFonts w:ascii="Calibri" w:eastAsia="Calibri" w:hAnsi="Calibri" w:cs="Calibri"/>
-              </w:rPr>
-              <w:t>paintComponent</w:t>
-            </w:r>
-            <w:proofErr w:type="spellEnd"/>
+              <w:t>Redrawn through paintComponent</w:t>
+            </w:r>
           </w:p>
         </w:tc>
       </w:tr>
@@ -10623,14 +10559,12 @@
                 <w:rFonts w:ascii="Calibri" w:eastAsia="Calibri" w:hAnsi="Calibri" w:cs="Calibri"/>
               </w:rPr>
             </w:pPr>
-            <w:proofErr w:type="spellStart"/>
             <w:r>
               <w:rPr>
                 <w:rFonts w:ascii="Calibri" w:eastAsia="Calibri" w:hAnsi="Calibri" w:cs="Calibri"/>
               </w:rPr>
               <w:t>JFrame</w:t>
             </w:r>
-            <w:proofErr w:type="spellEnd"/>
           </w:p>
         </w:tc>
         <w:tc>
@@ -10690,14 +10624,12 @@
                 <w:rFonts w:ascii="Calibri" w:eastAsia="Calibri" w:hAnsi="Calibri" w:cs="Calibri"/>
               </w:rPr>
             </w:pPr>
-            <w:proofErr w:type="spellStart"/>
             <w:r>
               <w:rPr>
                 <w:rFonts w:ascii="Calibri" w:eastAsia="Calibri" w:hAnsi="Calibri" w:cs="Calibri"/>
               </w:rPr>
               <w:t>JPanel</w:t>
             </w:r>
-            <w:proofErr w:type="spellEnd"/>
           </w:p>
         </w:tc>
         <w:tc>
@@ -10757,14 +10689,12 @@
                 <w:rFonts w:ascii="Calibri" w:eastAsia="Calibri" w:hAnsi="Calibri" w:cs="Calibri"/>
               </w:rPr>
             </w:pPr>
-            <w:proofErr w:type="spellStart"/>
             <w:r>
               <w:rPr>
                 <w:rFonts w:ascii="Calibri" w:eastAsia="Calibri" w:hAnsi="Calibri" w:cs="Calibri"/>
               </w:rPr>
               <w:t>JButton</w:t>
             </w:r>
-            <w:proofErr w:type="spellEnd"/>
           </w:p>
         </w:tc>
         <w:tc>
@@ -10824,14 +10754,12 @@
                 <w:rFonts w:ascii="Calibri" w:eastAsia="Calibri" w:hAnsi="Calibri" w:cs="Calibri"/>
               </w:rPr>
             </w:pPr>
-            <w:proofErr w:type="spellStart"/>
             <w:r>
               <w:rPr>
                 <w:rFonts w:ascii="Calibri" w:eastAsia="Calibri" w:hAnsi="Calibri" w:cs="Calibri"/>
               </w:rPr>
               <w:t>JTextArea</w:t>
             </w:r>
-            <w:proofErr w:type="spellEnd"/>
           </w:p>
         </w:tc>
         <w:tc>
@@ -10891,14 +10819,12 @@
                 <w:rFonts w:ascii="Calibri" w:eastAsia="Calibri" w:hAnsi="Calibri" w:cs="Calibri"/>
               </w:rPr>
             </w:pPr>
-            <w:proofErr w:type="spellStart"/>
             <w:r>
               <w:rPr>
                 <w:rFonts w:ascii="Calibri" w:eastAsia="Calibri" w:hAnsi="Calibri" w:cs="Calibri"/>
               </w:rPr>
               <w:t>JTextField</w:t>
             </w:r>
-            <w:proofErr w:type="spellEnd"/>
           </w:p>
         </w:tc>
         <w:tc>
@@ -10958,14 +10884,12 @@
                 <w:rFonts w:ascii="Calibri" w:eastAsia="Calibri" w:hAnsi="Calibri" w:cs="Calibri"/>
               </w:rPr>
             </w:pPr>
-            <w:proofErr w:type="spellStart"/>
             <w:r>
               <w:rPr>
                 <w:rFonts w:ascii="Calibri" w:eastAsia="Calibri" w:hAnsi="Calibri" w:cs="Calibri"/>
               </w:rPr>
               <w:t>JScrollPane</w:t>
             </w:r>
-            <w:proofErr w:type="spellEnd"/>
           </w:p>
         </w:tc>
         <w:tc>
@@ -11025,14 +10949,12 @@
                 <w:rFonts w:ascii="Calibri" w:eastAsia="Calibri" w:hAnsi="Calibri" w:cs="Calibri"/>
               </w:rPr>
             </w:pPr>
-            <w:proofErr w:type="spellStart"/>
             <w:r>
               <w:rPr>
                 <w:rFonts w:ascii="Calibri" w:eastAsia="Calibri" w:hAnsi="Calibri" w:cs="Calibri"/>
               </w:rPr>
               <w:t>JLabel</w:t>
             </w:r>
-            <w:proofErr w:type="spellEnd"/>
           </w:p>
         </w:tc>
         <w:tc>
@@ -11157,14 +11079,12 @@
                 <w:rFonts w:ascii="Calibri" w:eastAsia="Calibri" w:hAnsi="Calibri" w:cs="Calibri"/>
               </w:rPr>
             </w:pPr>
-            <w:proofErr w:type="spellStart"/>
             <w:r>
               <w:rPr>
                 <w:rFonts w:ascii="Calibri" w:eastAsia="Calibri" w:hAnsi="Calibri" w:cs="Calibri"/>
               </w:rPr>
               <w:t>JRadioButton</w:t>
             </w:r>
-            <w:proofErr w:type="spellEnd"/>
           </w:p>
         </w:tc>
         <w:tc>
@@ -11407,21 +11327,7 @@
               <w:rPr>
                 <w:rFonts w:ascii="Calibri" w:eastAsia="Calibri" w:hAnsi="Calibri" w:cs="Calibri"/>
               </w:rPr>
-              <w:t xml:space="preserve">A common </w:t>
-            </w:r>
-            <w:proofErr w:type="spellStart"/>
-            <w:r>
-              <w:rPr>
-                <w:rFonts w:ascii="Calibri" w:eastAsia="Calibri" w:hAnsi="Calibri" w:cs="Calibri"/>
-              </w:rPr>
-              <w:t>PathModel</w:t>
-            </w:r>
-            <w:proofErr w:type="spellEnd"/>
-            <w:r>
-              <w:rPr>
-                <w:rFonts w:ascii="Calibri" w:eastAsia="Calibri" w:hAnsi="Calibri" w:cs="Calibri"/>
-              </w:rPr>
-              <w:t xml:space="preserve"> for the game that avoids duplicate methods across the three paths</w:t>
+              <w:t>A common PathModel for the game that avoids duplicate methods across the three paths</w:t>
             </w:r>
             <w:r>
               <w:rPr>
@@ -11557,35 +11463,7 @@
               <w:rPr>
                 <w:rFonts w:ascii="Calibri" w:eastAsia="Calibri" w:hAnsi="Calibri" w:cs="Calibri"/>
               </w:rPr>
-              <w:t xml:space="preserve">Links the Model and View with ActionListener, </w:t>
-            </w:r>
-            <w:proofErr w:type="spellStart"/>
-            <w:r>
-              <w:rPr>
-                <w:rFonts w:ascii="Calibri" w:eastAsia="Calibri" w:hAnsi="Calibri" w:cs="Calibri"/>
-              </w:rPr>
-              <w:t>MouseListener</w:t>
-            </w:r>
-            <w:proofErr w:type="spellEnd"/>
-            <w:r>
-              <w:rPr>
-                <w:rFonts w:ascii="Calibri" w:eastAsia="Calibri" w:hAnsi="Calibri" w:cs="Calibri"/>
-              </w:rPr>
-              <w:t xml:space="preserve">, </w:t>
-            </w:r>
-            <w:proofErr w:type="spellStart"/>
-            <w:r>
-              <w:rPr>
-                <w:rFonts w:ascii="Calibri" w:eastAsia="Calibri" w:hAnsi="Calibri" w:cs="Calibri"/>
-              </w:rPr>
-              <w:t>MouseMotionListener</w:t>
-            </w:r>
-            <w:proofErr w:type="spellEnd"/>
-            <w:r>
-              <w:rPr>
-                <w:rFonts w:ascii="Calibri" w:eastAsia="Calibri" w:hAnsi="Calibri" w:cs="Calibri"/>
-              </w:rPr>
-              <w:t>, logic inside path classes</w:t>
+              <w:t>Links the Model and View with ActionListener, MouseListener, MouseMotionListener, logic inside path classes</w:t>
             </w:r>
           </w:p>
         </w:tc>
@@ -11999,14 +11877,12 @@
                                     <w:rFonts w:ascii="Calibri" w:eastAsia="Calibri" w:hAnsi="Calibri" w:cs="Calibri"/>
                                   </w:rPr>
                                 </w:pPr>
-                                <w:proofErr w:type="spellStart"/>
                                 <w:r>
                                   <w:rPr>
                                     <w:rFonts w:ascii="Calibri" w:eastAsia="Calibri" w:hAnsi="Calibri" w:cs="Calibri"/>
                                   </w:rPr>
                                   <w:t>MouseMotionListener</w:t>
                                 </w:r>
-                                <w:proofErr w:type="spellEnd"/>
                               </w:p>
                               <w:p>
                                 <w:pPr>
@@ -12281,14 +12157,12 @@
                               <w:rFonts w:ascii="Calibri" w:eastAsia="Calibri" w:hAnsi="Calibri" w:cs="Calibri"/>
                             </w:rPr>
                           </w:pPr>
-                          <w:proofErr w:type="spellStart"/>
                           <w:r>
                             <w:rPr>
                               <w:rFonts w:ascii="Calibri" w:eastAsia="Calibri" w:hAnsi="Calibri" w:cs="Calibri"/>
                             </w:rPr>
                             <w:t>MouseMotionListener</w:t>
                           </w:r>
-                          <w:proofErr w:type="spellEnd"/>
                         </w:p>
                         <w:p>
                           <w:pPr>
@@ -13606,7 +13480,7 @@
   <w:docDefaults>
     <w:rPrDefault>
       <w:rPr>
-        <w:rFonts w:ascii="Arial" w:eastAsia="Arial" w:hAnsi="Arial" w:cs="Arial"/>
+        <w:rFonts w:ascii="Arial" w:eastAsiaTheme="minorEastAsia" w:hAnsi="Arial" w:cs="Arial"/>
         <w:sz w:val="22"/>
         <w:szCs w:val="22"/>
         <w:lang w:val="en" w:eastAsia="zh-TW" w:bidi="ar-SA"/>

</xml_diff>